<commit_message>
Improving the assessment of rag.
</commit_message>
<xml_diff>
--- a/docs/Rapport technique.docx
+++ b/docs/Rapport technique.docx
@@ -1022,14 +1022,14 @@
         <w:rPr>
           <w:b/>
         </w:rPr>
-        <w:t xml:space="preserve">Dix questions avec leurs bonnes réponses. </w:t>
+        <w:t>Dix questions avec leurs bonnes réponses.</w:t>
       </w:r>
       <w:r>
         <w:rPr>
           <w:b w:val="false"/>
           <w:bCs w:val="false"/>
         </w:rPr>
-        <w:t>Rédigées à la main. Elles couvrent jeunesse, emploi, concerts, expo et cinéma.</w:t>
+        <w:t xml:space="preserve"> Elles couvrent jeunesse, emploi, concerts, expo et cinéma.</w:t>
       </w:r>
       <w:r>
         <w:rPr/>
@@ -1064,6 +1064,37 @@
       <w:r>
         <w:rPr/>
         <w:t>Une réponse est bonne si elle dit la même chose. Même sens, mêmes infos.</w:t>
+      </w:r>
+    </w:p>
+    <w:p>
+      <w:pPr>
+        <w:pStyle w:val="normal1"/>
+        <w:numPr>
+          <w:ilvl w:val="1"/>
+          <w:numId w:val="9"/>
+        </w:numPr>
+        <w:spacing w:lineRule="auto" w:line="240"/>
+        <w:rPr/>
+      </w:pPr>
+      <w:r>
+        <w:rPr/>
+        <w:t>Le</w:t>
+      </w:r>
+      <w:r>
+        <w:rPr/>
+        <w:t>s 10 questions du</w:t>
+      </w:r>
+      <w:r>
+        <w:rPr/>
+        <w:t xml:space="preserve"> dataset contien</w:t>
+      </w:r>
+      <w:r>
+        <w:rPr/>
+        <w:t xml:space="preserve">nent </w:t>
+      </w:r>
+      <w:r>
+        <w:rPr/>
+        <w:t>la liste des sources qui permettent d’y répondre le mieux.</w:t>
         <w:br/>
       </w:r>
     </w:p>
@@ -1120,15 +1151,41 @@
       </w:r>
       <w:r>
         <w:rPr/>
-        <w:t xml:space="preserve"> (recall RAG) : Le script eval/evaluate_rag.py interroge le RAG directement pour chaque question du dataset et compare les uid retournés aux sources attendues. Le dataset contient 10 questions, </w:t>
-      </w:r>
-      <w:r>
-        <w:rPr/>
-        <w:t>où chacune contient la liste des sources qui permettent d’y répondre le mieux</w:t>
-      </w:r>
-      <w:r>
-        <w:rPr/>
-        <w:t>.</w:t>
+        <w:t xml:space="preserve"> (recall RAG) : Le script </w:t>
+      </w:r>
+      <w:r>
+        <w:rPr>
+          <w:i/>
+          <w:iCs/>
+        </w:rPr>
+        <w:t>eval/evaluate_rag.py</w:t>
+      </w:r>
+      <w:r>
+        <w:rPr/>
+        <w:t xml:space="preserve"> interroge le RAG directement pour chaque question du dataset et compare les uid retournés aux sources attendues.</w:t>
+      </w:r>
+    </w:p>
+    <w:p>
+      <w:pPr>
+        <w:pStyle w:val="normal1"/>
+        <w:numPr>
+          <w:ilvl w:val="0"/>
+          <w:numId w:val="0"/>
+        </w:numPr>
+        <w:spacing w:lineRule="auto" w:line="240"/>
+        <w:ind w:hanging="0" w:start="1440"/>
+        <w:rPr/>
+      </w:pPr>
+      <w:r>
+        <w:rPr>
+          <w:b/>
+          <w:bCs/>
+        </w:rPr>
+        <w:t>Résultat</w:t>
+      </w:r>
+      <w:r>
+        <w:rPr/>
+        <w:t xml:space="preserve"> : 76 % de rappel (167 sources retrouvées sur 219 attendues). Les questions précises atteignent 100 %. Les écarts viennent du RAG lors de questions générales : certaines sources pertinentes ne remontent pas dans le top_k pour des questions plus larges (art contemporain, BTP, patrimoine).</w:t>
       </w:r>
     </w:p>
     <w:p>
@@ -1146,27 +1203,118 @@
           <w:b/>
           <w:bCs/>
         </w:rPr>
+        <w:t>Évaluation qualitative des réponses avec Ragas</w:t>
+      </w:r>
+      <w:r>
+        <w:rPr/>
+        <w:t xml:space="preserve"> : le script </w:t>
+      </w:r>
+      <w:r>
+        <w:rPr>
+          <w:i/>
+          <w:iCs/>
+        </w:rPr>
+        <w:t>eval/eval_qualite.py</w:t>
+      </w:r>
+      <w:r>
+        <w:rPr/>
+        <w:t xml:space="preserve"> interroge le chatbot pour chaque question du dataset, récupère la réponse générée ainsi que les contextes utilisés, puis les compare à la réponse humaine annotée (reponse_attendue) à l'aide de quatre métriques jugées par un LLM local.</w:t>
+      </w:r>
+    </w:p>
+    <w:p>
+      <w:pPr>
+        <w:pStyle w:val="normal1"/>
+        <w:numPr>
+          <w:ilvl w:val="0"/>
+          <w:numId w:val="0"/>
+        </w:numPr>
+        <w:spacing w:lineRule="auto" w:line="240"/>
+        <w:ind w:hanging="0" w:start="1440"/>
+        <w:rPr/>
+      </w:pPr>
+      <w:r>
+        <w:rPr/>
+        <w:t>On notera que pour cette évaluation, le modèle n’utilise pas de chaîne de raisonnement. Cela peut diminuer la qualité de l’évaluation.</w:t>
+      </w:r>
+    </w:p>
+    <w:p>
+      <w:pPr>
+        <w:pStyle w:val="normal1"/>
+        <w:numPr>
+          <w:ilvl w:val="0"/>
+          <w:numId w:val="0"/>
+        </w:numPr>
+        <w:spacing w:lineRule="auto" w:line="240"/>
+        <w:ind w:hanging="0" w:start="1440"/>
+        <w:rPr/>
+      </w:pPr>
+      <w:r>
+        <w:rPr>
+          <w:b/>
+          <w:bCs/>
+        </w:rPr>
         <w:t>Résultat</w:t>
       </w:r>
       <w:r>
         <w:rPr/>
-        <w:t xml:space="preserve"> : 76 % de rappel (167 sources retrouvées sur 219 attendues). Les questions </w:t>
-      </w:r>
-      <w:r>
-        <w:rPr/>
-        <w:t>précises</w:t>
-      </w:r>
-      <w:r>
-        <w:rPr/>
-        <w:t xml:space="preserve"> atteignent 100 %. Les écarts viennent du RAG </w:t>
-      </w:r>
-      <w:r>
-        <w:rPr/>
-        <w:t>lors de questions générales</w:t>
-      </w:r>
-      <w:r>
-        <w:rPr/>
-        <w:t> : certaines sources pertinentes ne remontent pas dans le top_k pour des questions plus larges (art contemporain, BTP, patrimoine).</w:t>
+        <w:t> :</w:t>
+      </w:r>
+    </w:p>
+    <w:p>
+      <w:pPr>
+        <w:pStyle w:val="normal1"/>
+        <w:numPr>
+          <w:ilvl w:val="2"/>
+          <w:numId w:val="9"/>
+        </w:numPr>
+        <w:spacing w:lineRule="auto" w:line="240"/>
+        <w:rPr/>
+      </w:pPr>
+      <w:r>
+        <w:rPr/>
+        <w:t>U</w:t>
+      </w:r>
+      <w:r>
+        <w:rPr/>
+        <w:t>ne fidélité au contexte de 0,90 : le modèle reprend très bien les informations présentes dans ses sources, sans halluciner.</w:t>
+      </w:r>
+    </w:p>
+    <w:p>
+      <w:pPr>
+        <w:pStyle w:val="normal1"/>
+        <w:numPr>
+          <w:ilvl w:val="2"/>
+          <w:numId w:val="9"/>
+        </w:numPr>
+        <w:spacing w:lineRule="auto" w:line="240"/>
+        <w:rPr/>
+      </w:pPr>
+      <w:r>
+        <w:rPr/>
+        <w:t>Le rappel de contexte s'établit à 0,71 : les documents récupérés couvrent environ 71 % des informations de la réponse attendue.</w:t>
+      </w:r>
+    </w:p>
+    <w:p>
+      <w:pPr>
+        <w:pStyle w:val="normal1"/>
+        <w:numPr>
+          <w:ilvl w:val="2"/>
+          <w:numId w:val="9"/>
+        </w:numPr>
+        <w:spacing w:lineRule="auto" w:line="240"/>
+        <w:rPr/>
+      </w:pPr>
+      <w:r>
+        <w:rPr/>
+        <w:t xml:space="preserve">La précision de contexte </w:t>
+      </w:r>
+      <w:r>
+        <w:rPr/>
+        <w:t xml:space="preserve">est de </w:t>
+      </w:r>
+      <w:r>
+        <w:rPr/>
+        <w:t>0,38 : les sources pertinentes sont récupérées mais mal classées.</w:t>
         <w:br/>
       </w:r>
     </w:p>
@@ -1210,7 +1358,15 @@
       </w:pPr>
       <w:r>
         <w:rPr/>
-        <w:t>Il semble que le point d’amélioration réside dans le dataset (qui ne liste pas les évènements précis attendu) ; et le modèle d’embedding qui est très léger mais perd en précision (deux phrases ayant le même sens ont deux réponses relativement éloignées ~0.8).</w:t>
+        <w:t xml:space="preserve">Il semble que </w:t>
+      </w:r>
+      <w:r>
+        <w:rPr/>
+        <w:t xml:space="preserve">la principale </w:t>
+      </w:r>
+      <w:r>
+        <w:rPr/>
+        <w:t>amélioration réside dans le dataset (qui ne liste pas les évènements précis attendu) ; et le modèle d’embedding qui est très léger mais perd en précision (deux phrases ayant le même sens ont deux réponses relativement éloignées ~0.8).</w:t>
       </w:r>
     </w:p>
     <w:p>
@@ -1220,6 +1376,21 @@
           <w:ilvl w:val="1"/>
           <w:numId w:val="9"/>
         </w:numPr>
+        <w:spacing w:lineRule="auto" w:line="240"/>
+        <w:rPr/>
+      </w:pPr>
+      <w:r>
+        <w:rPr/>
+        <w:t>Il serait également possible d’améliorer la précision de contexte en améliorant le prompt et peut-être en passant sur un modèle de raisonnement.</w:t>
+      </w:r>
+    </w:p>
+    <w:p>
+      <w:pPr>
+        <w:pStyle w:val="normal1"/>
+        <w:numPr>
+          <w:ilvl w:val="1"/>
+          <w:numId w:val="9"/>
+        </w:numPr>
         <w:spacing w:lineRule="auto" w:line="240" w:before="0" w:after="240"/>
         <w:rPr/>
       </w:pPr>
@@ -1343,40 +1514,14 @@
         <w:rPr>
           <w:b/>
         </w:rPr>
-        <w:t xml:space="preserve">Dix questions </w:t>
-      </w:r>
-      <w:r>
-        <w:rPr>
-          <w:b/>
-        </w:rPr>
-        <w:t>dans le dataset de test</w:t>
-      </w:r>
-      <w:r>
-        <w:rPr>
-          <w:b/>
-        </w:rPr>
-        <w:t xml:space="preserve"> : </w:t>
+        <w:t xml:space="preserve">Dix questions dans le dataset de test : </w:t>
       </w:r>
       <w:r>
         <w:rPr>
           <w:b w:val="false"/>
           <w:bCs w:val="false"/>
         </w:rPr>
-        <w:t xml:space="preserve">un dataset plus large permettraient d’évaluer le rag avec plus de précision </w:t>
-      </w:r>
-      <w:r>
-        <w:rPr>
-          <w:b w:val="false"/>
-          <w:bCs w:val="false"/>
-        </w:rPr>
-        <w:t>et de pertinence</w:t>
-      </w:r>
-      <w:r>
-        <w:rPr>
-          <w:b w:val="false"/>
-          <w:bCs w:val="false"/>
-        </w:rPr>
-        <w:t>.</w:t>
+        <w:t>un dataset plus large permettraient d’évaluer le rag avec plus de précision et de pertinence.</w:t>
       </w:r>
       <w:r>
         <w:rPr/>
@@ -1455,15 +1600,7 @@
       </w:pPr>
       <w:r>
         <w:rPr/>
-        <w:t xml:space="preserve">Une partie du projet avait été développée </w:t>
-      </w:r>
-      <w:r>
-        <w:rPr/>
-        <w:t xml:space="preserve">par ailleurs </w:t>
-      </w:r>
-      <w:r>
-        <w:rPr/>
-        <w:t>dans le cadre de mon entreprise :</w:t>
+        <w:t>Une partie du projet avait été développée par ailleurs dans le cadre de mon entreprise :</w:t>
       </w:r>
     </w:p>
     <w:p>
@@ -4486,7 +4623,7 @@
     <w:pPr>
       <w:widowControl w:val="false"/>
       <w:suppressAutoHyphens w:val="true"/>
-      <w:overflowPunct w:val="false"/>
+      <w:overflowPunct w:val="true"/>
       <w:bidi w:val="0"/>
       <w:spacing w:before="0" w:after="0"/>
       <w:jc w:val="start"/>
@@ -4620,7 +4757,7 @@
     <w:qFormat/>
     <w:rPr/>
   </w:style>
-  <w:style w:type="paragraph" w:styleId="Titre">
+  <w:style w:type="paragraph" w:styleId="Titre" w:customStyle="1">
     <w:name w:val="Titre"/>
     <w:basedOn w:val="Normal"/>
     <w:next w:val="BodyText"/>
@@ -4678,7 +4815,7 @@
       <w:rFonts w:cs="FreeSans"/>
     </w:rPr>
   </w:style>
-  <w:style w:type="paragraph" w:styleId="Titreuser" w:customStyle="1">
+  <w:style w:type="paragraph" w:styleId="Titreuser">
     <w:name w:val="Titre (user)"/>
     <w:basedOn w:val="Normal"/>
     <w:next w:val="BodyText"/>
@@ -4715,7 +4852,7 @@
     <w:pPr>
       <w:widowControl/>
       <w:suppressAutoHyphens w:val="true"/>
-      <w:overflowPunct w:val="false"/>
+      <w:overflowPunct w:val="true"/>
       <w:bidi w:val="0"/>
       <w:spacing w:lineRule="auto" w:line="276" w:before="0" w:after="0"/>
       <w:jc w:val="start"/>
@@ -4746,8 +4883,8 @@
       <w:szCs w:val="30"/>
     </w:rPr>
   </w:style>
-  <w:style w:type="numbering" w:styleId="Pasdelisteuser" w:default="1">
-    <w:name w:val="Pas de liste (user)"/>
+  <w:style w:type="numbering" w:styleId="Pasdeliste" w:default="1">
+    <w:name w:val="Pas de liste"/>
     <w:uiPriority w:val="99"/>
     <w:semiHidden/>
     <w:unhideWhenUsed/>

</xml_diff>